<commit_message>
User get profile at 1:31 AM
</commit_message>
<xml_diff>
--- a/Learning.docx
+++ b/Learning.docx
@@ -309,14 +309,12 @@
         <w:rPr>
           <w:sz w:val="28"/>
           <w:szCs w:val="28"/>
-          <w:lang w:val="en-PK"/>
-        </w:rPr>
-      </w:pPr>
-      <w:r>
-        <w:rPr>
-          <w:sz w:val="28"/>
-          <w:szCs w:val="28"/>
-          <w:lang w:val="en-PK"/>
+        </w:rPr>
+      </w:pPr>
+      <w:r>
+        <w:rPr>
+          <w:sz w:val="28"/>
+          <w:szCs w:val="28"/>
         </w:rPr>
         <w:t xml:space="preserve">Pydantic always expects input data from your side in the form of dictionary </w:t>
       </w:r>
@@ -329,16 +327,14 @@
           <w:bCs/>
           <w:sz w:val="28"/>
           <w:szCs w:val="28"/>
-          <w:lang w:val="en-PK"/>
-        </w:rPr>
-      </w:pPr>
-      <w:r>
-        <w:rPr>
-          <w:b/>
-          <w:bCs/>
-          <w:sz w:val="28"/>
-          <w:szCs w:val="28"/>
-          <w:lang w:val="en-PK"/>
+        </w:rPr>
+      </w:pPr>
+      <w:r>
+        <w:rPr>
+          <w:b/>
+          <w:bCs/>
+          <w:sz w:val="28"/>
+          <w:szCs w:val="28"/>
         </w:rPr>
         <w:t>Understanding Pydantic vs. ORM (SQLAlchemy)</w:t>
       </w:r>
@@ -349,14 +345,12 @@
         <w:rPr>
           <w:sz w:val="28"/>
           <w:szCs w:val="28"/>
-          <w:lang w:val="en-PK"/>
-        </w:rPr>
-      </w:pPr>
-      <w:r>
-        <w:rPr>
-          <w:sz w:val="28"/>
-          <w:szCs w:val="28"/>
-          <w:lang w:val="en-PK"/>
+        </w:rPr>
+      </w:pPr>
+      <w:r>
+        <w:rPr>
+          <w:sz w:val="28"/>
+          <w:szCs w:val="28"/>
         </w:rPr>
         <w:t xml:space="preserve">In FastAPI development, we use </w:t>
       </w:r>
@@ -366,7 +360,6 @@
           <w:bCs/>
           <w:sz w:val="28"/>
           <w:szCs w:val="28"/>
-          <w:lang w:val="en-PK"/>
         </w:rPr>
         <w:t>Pydantic Models</w:t>
       </w:r>
@@ -374,7 +367,6 @@
         <w:rPr>
           <w:sz w:val="28"/>
           <w:szCs w:val="28"/>
-          <w:lang w:val="en-PK"/>
         </w:rPr>
         <w:t xml:space="preserve"> for data validation and </w:t>
       </w:r>
@@ -384,7 +376,6 @@
           <w:bCs/>
           <w:sz w:val="28"/>
           <w:szCs w:val="28"/>
-          <w:lang w:val="en-PK"/>
         </w:rPr>
         <w:t>SQLAlchemy Models</w:t>
       </w:r>
@@ -392,7 +383,6 @@
         <w:rPr>
           <w:sz w:val="28"/>
           <w:szCs w:val="28"/>
-          <w:lang w:val="en-PK"/>
         </w:rPr>
         <w:t xml:space="preserve"> for database interaction. By default, these two don't talk to each other easily because they handle data differently.</w:t>
       </w:r>
@@ -405,16 +395,14 @@
           <w:bCs/>
           <w:sz w:val="28"/>
           <w:szCs w:val="28"/>
-          <w:lang w:val="en-PK"/>
-        </w:rPr>
-      </w:pPr>
-      <w:r>
-        <w:rPr>
-          <w:b/>
-          <w:bCs/>
-          <w:sz w:val="28"/>
-          <w:szCs w:val="28"/>
-          <w:lang w:val="en-PK"/>
+        </w:rPr>
+      </w:pPr>
+      <w:r>
+        <w:rPr>
+          <w:b/>
+          <w:bCs/>
+          <w:sz w:val="28"/>
+          <w:szCs w:val="28"/>
         </w:rPr>
         <w:t>1. Default Behavior (Without from_attributes = True)</w:t>
       </w:r>
@@ -425,14 +413,12 @@
         <w:rPr>
           <w:sz w:val="28"/>
           <w:szCs w:val="28"/>
-          <w:lang w:val="en-PK"/>
-        </w:rPr>
-      </w:pPr>
-      <w:r>
-        <w:rPr>
-          <w:sz w:val="28"/>
-          <w:szCs w:val="28"/>
-          <w:lang w:val="en-PK"/>
+        </w:rPr>
+      </w:pPr>
+      <w:r>
+        <w:rPr>
+          <w:sz w:val="28"/>
+          <w:szCs w:val="28"/>
         </w:rPr>
         <w:t xml:space="preserve">By default, Pydantic is designed to work with </w:t>
       </w:r>
@@ -442,7 +428,6 @@
           <w:bCs/>
           <w:sz w:val="28"/>
           <w:szCs w:val="28"/>
-          <w:lang w:val="en-PK"/>
         </w:rPr>
         <w:t>Python Dictionaries</w:t>
       </w:r>
@@ -450,7 +435,6 @@
         <w:rPr>
           <w:sz w:val="28"/>
           <w:szCs w:val="28"/>
-          <w:lang w:val="en-PK"/>
         </w:rPr>
         <w:t>. It expects data in a key: value format, like data["username"].</w:t>
       </w:r>
@@ -464,16 +448,14 @@
         <w:rPr>
           <w:sz w:val="28"/>
           <w:szCs w:val="28"/>
-          <w:lang w:val="en-PK"/>
-        </w:rPr>
-      </w:pPr>
-      <w:r>
-        <w:rPr>
-          <w:b/>
-          <w:bCs/>
-          <w:sz w:val="28"/>
-          <w:szCs w:val="28"/>
-          <w:lang w:val="en-PK"/>
+        </w:rPr>
+      </w:pPr>
+      <w:r>
+        <w:rPr>
+          <w:b/>
+          <w:bCs/>
+          <w:sz w:val="28"/>
+          <w:szCs w:val="28"/>
         </w:rPr>
         <w:t>The Problem:</w:t>
       </w:r>
@@ -481,7 +463,6 @@
         <w:rPr>
           <w:sz w:val="28"/>
           <w:szCs w:val="28"/>
-          <w:lang w:val="en-PK"/>
         </w:rPr>
         <w:t xml:space="preserve"> When you fetch data from a database using SQLAlchemy, it returns a </w:t>
       </w:r>
@@ -491,7 +472,6 @@
           <w:bCs/>
           <w:sz w:val="28"/>
           <w:szCs w:val="28"/>
-          <w:lang w:val="en-PK"/>
         </w:rPr>
         <w:t>Class Instance (Object)</w:t>
       </w:r>
@@ -499,7 +479,6 @@
         <w:rPr>
           <w:sz w:val="28"/>
           <w:szCs w:val="28"/>
-          <w:lang w:val="en-PK"/>
         </w:rPr>
         <w:t>, not a dictionary.</w:t>
       </w:r>
@@ -513,16 +492,14 @@
         <w:rPr>
           <w:sz w:val="28"/>
           <w:szCs w:val="28"/>
-          <w:lang w:val="en-PK"/>
-        </w:rPr>
-      </w:pPr>
-      <w:r>
-        <w:rPr>
-          <w:b/>
-          <w:bCs/>
-          <w:sz w:val="28"/>
-          <w:szCs w:val="28"/>
-          <w:lang w:val="en-PK"/>
+        </w:rPr>
+      </w:pPr>
+      <w:r>
+        <w:rPr>
+          <w:b/>
+          <w:bCs/>
+          <w:sz w:val="28"/>
+          <w:szCs w:val="28"/>
         </w:rPr>
         <w:t>The Error:</w:t>
       </w:r>
@@ -530,25 +507,8 @@
         <w:rPr>
           <w:sz w:val="28"/>
           <w:szCs w:val="28"/>
-          <w:lang w:val="en-PK"/>
-        </w:rPr>
-        <w:t xml:space="preserve"> If you try to pass this database object directly to a Pydantic model, Pydantic will fail. It will throw a ValidationError because it cannot find the data in the "Object" format (e.g., </w:t>
-      </w:r>
-      <w:r>
-        <w:rPr>
-          <w:sz w:val="28"/>
-          <w:szCs w:val="28"/>
-          <w:lang w:val="en-PK"/>
-        </w:rPr>
-        <w:t>user. username</w:t>
-      </w:r>
-      <w:r>
-        <w:rPr>
-          <w:sz w:val="28"/>
-          <w:szCs w:val="28"/>
-          <w:lang w:val="en-PK"/>
-        </w:rPr>
-        <w:t>).</w:t>
+        </w:rPr>
+        <w:t xml:space="preserve"> If you try to pass this database object directly to a Pydantic model, Pydantic will fail. It will throw a ValidationError because it cannot find the data in the "Object" format (e.g., user. username).</w:t>
       </w:r>
     </w:p>
     <w:p>
@@ -559,16 +519,14 @@
           <w:bCs/>
           <w:sz w:val="28"/>
           <w:szCs w:val="28"/>
-          <w:lang w:val="en-PK"/>
-        </w:rPr>
-      </w:pPr>
-      <w:r>
-        <w:rPr>
-          <w:b/>
-          <w:bCs/>
-          <w:sz w:val="28"/>
-          <w:szCs w:val="28"/>
-          <w:lang w:val="en-PK"/>
+        </w:rPr>
+      </w:pPr>
+      <w:r>
+        <w:rPr>
+          <w:b/>
+          <w:bCs/>
+          <w:sz w:val="28"/>
+          <w:szCs w:val="28"/>
         </w:rPr>
         <w:t>2. The Solution: from_attributes = True (formerly orm_mode)</w:t>
       </w:r>
@@ -579,14 +537,12 @@
         <w:rPr>
           <w:sz w:val="28"/>
           <w:szCs w:val="28"/>
-          <w:lang w:val="en-PK"/>
-        </w:rPr>
-      </w:pPr>
-      <w:r>
-        <w:rPr>
-          <w:sz w:val="28"/>
-          <w:szCs w:val="28"/>
-          <w:lang w:val="en-PK"/>
+        </w:rPr>
+      </w:pPr>
+      <w:r>
+        <w:rPr>
+          <w:sz w:val="28"/>
+          <w:szCs w:val="28"/>
         </w:rPr>
         <w:t xml:space="preserve">When we set from_attributes = True inside the Pydantic model_config, we give Pydantic the "power" to read data from </w:t>
       </w:r>
@@ -596,7 +552,6 @@
           <w:bCs/>
           <w:sz w:val="28"/>
           <w:szCs w:val="28"/>
-          <w:lang w:val="en-PK"/>
         </w:rPr>
         <w:t>Objects</w:t>
       </w:r>
@@ -604,7 +559,6 @@
         <w:rPr>
           <w:sz w:val="28"/>
           <w:szCs w:val="28"/>
-          <w:lang w:val="en-PK"/>
         </w:rPr>
         <w:t xml:space="preserve"> just as easily as from </w:t>
       </w:r>
@@ -614,7 +568,6 @@
           <w:bCs/>
           <w:sz w:val="28"/>
           <w:szCs w:val="28"/>
-          <w:lang w:val="en-PK"/>
         </w:rPr>
         <w:t>Dictionaries</w:t>
       </w:r>
@@ -622,7 +575,6 @@
         <w:rPr>
           <w:sz w:val="28"/>
           <w:szCs w:val="28"/>
-          <w:lang w:val="en-PK"/>
         </w:rPr>
         <w:t>.</w:t>
       </w:r>
@@ -636,16 +588,14 @@
         <w:rPr>
           <w:sz w:val="28"/>
           <w:szCs w:val="28"/>
-          <w:lang w:val="en-PK"/>
-        </w:rPr>
-      </w:pPr>
-      <w:r>
-        <w:rPr>
-          <w:b/>
-          <w:bCs/>
-          <w:sz w:val="28"/>
-          <w:szCs w:val="28"/>
-          <w:lang w:val="en-PK"/>
+        </w:rPr>
+      </w:pPr>
+      <w:r>
+        <w:rPr>
+          <w:b/>
+          <w:bCs/>
+          <w:sz w:val="28"/>
+          <w:szCs w:val="28"/>
         </w:rPr>
         <w:t>How it works:</w:t>
       </w:r>
@@ -653,7 +603,6 @@
         <w:rPr>
           <w:sz w:val="28"/>
           <w:szCs w:val="28"/>
-          <w:lang w:val="en-PK"/>
         </w:rPr>
         <w:t xml:space="preserve"> Pydantic will now look for data in two ways:</w:t>
       </w:r>
@@ -667,16 +616,14 @@
         <w:rPr>
           <w:sz w:val="28"/>
           <w:szCs w:val="28"/>
-          <w:lang w:val="en-PK"/>
-        </w:rPr>
-      </w:pPr>
-      <w:r>
-        <w:rPr>
-          <w:b/>
-          <w:bCs/>
-          <w:sz w:val="28"/>
-          <w:szCs w:val="28"/>
-          <w:lang w:val="en-PK"/>
+        </w:rPr>
+      </w:pPr>
+      <w:r>
+        <w:rPr>
+          <w:b/>
+          <w:bCs/>
+          <w:sz w:val="28"/>
+          <w:szCs w:val="28"/>
         </w:rPr>
         <w:t>Dictionary Style:</w:t>
       </w:r>
@@ -684,7 +631,6 @@
         <w:rPr>
           <w:sz w:val="28"/>
           <w:szCs w:val="28"/>
-          <w:lang w:val="en-PK"/>
         </w:rPr>
         <w:t xml:space="preserve"> data["username"]</w:t>
       </w:r>
@@ -698,16 +644,14 @@
         <w:rPr>
           <w:sz w:val="28"/>
           <w:szCs w:val="28"/>
-          <w:lang w:val="en-PK"/>
-        </w:rPr>
-      </w:pPr>
-      <w:r>
-        <w:rPr>
-          <w:b/>
-          <w:bCs/>
-          <w:sz w:val="28"/>
-          <w:szCs w:val="28"/>
-          <w:lang w:val="en-PK"/>
+        </w:rPr>
+      </w:pPr>
+      <w:r>
+        <w:rPr>
+          <w:b/>
+          <w:bCs/>
+          <w:sz w:val="28"/>
+          <w:szCs w:val="28"/>
         </w:rPr>
         <w:t>Attribute Style:</w:t>
       </w:r>
@@ -715,7 +659,6 @@
         <w:rPr>
           <w:sz w:val="28"/>
           <w:szCs w:val="28"/>
-          <w:lang w:val="en-PK"/>
         </w:rPr>
         <w:t xml:space="preserve"> </w:t>
       </w:r>
@@ -723,7 +666,6 @@
         <w:rPr>
           <w:sz w:val="28"/>
           <w:szCs w:val="28"/>
-          <w:lang w:val="en-PK"/>
         </w:rPr>
         <w:t>data. username</w:t>
       </w:r>
@@ -731,13 +673,628 @@
         <w:rPr>
           <w:sz w:val="28"/>
           <w:szCs w:val="28"/>
-          <w:lang w:val="en-PK"/>
         </w:rPr>
         <w:t xml:space="preserve"> (This is how SQLAlchemy provides data).</w:t>
       </w:r>
     </w:p>
     <w:p>
       <w:pPr>
+        <w:pStyle w:val="ListParagraph"/>
+        <w:numPr>
+          <w:ilvl w:val="0"/>
+          <w:numId w:val="3"/>
+        </w:numPr>
+        <w:rPr>
+          <w:sz w:val="28"/>
+          <w:szCs w:val="28"/>
+          <w:lang w:val="en-PK"/>
+        </w:rPr>
+      </w:pPr>
+      <w:r>
+        <w:rPr>
+          <w:b/>
+          <w:bCs/>
+          <w:sz w:val="28"/>
+          <w:szCs w:val="28"/>
+        </w:rPr>
+        <w:t>3</w:t>
+      </w:r>
+      <w:r>
+        <w:rPr>
+          <w:b/>
+          <w:bCs/>
+          <w:sz w:val="28"/>
+          <w:szCs w:val="28"/>
+        </w:rPr>
+        <w:t xml:space="preserve">. </w:t>
+      </w:r>
+      <w:r>
+        <w:rPr>
+          <w:b/>
+          <w:bCs/>
+          <w:sz w:val="28"/>
+          <w:szCs w:val="28"/>
+        </w:rPr>
+        <w:t>OAuth2PasswordBearer:</w:t>
+      </w:r>
+      <w:r>
+        <w:rPr>
+          <w:sz w:val="28"/>
+          <w:szCs w:val="28"/>
+        </w:rPr>
+        <w:t xml:space="preserve"> This module in Fast API used for checking whether user has the token or not if user don’t have the </w:t>
+      </w:r>
+      <w:proofErr w:type="gramStart"/>
+      <w:r>
+        <w:rPr>
+          <w:sz w:val="28"/>
+          <w:szCs w:val="28"/>
+        </w:rPr>
+        <w:t>token</w:t>
+      </w:r>
+      <w:proofErr w:type="gramEnd"/>
+      <w:r>
+        <w:rPr>
+          <w:sz w:val="28"/>
+          <w:szCs w:val="28"/>
+        </w:rPr>
+        <w:t xml:space="preserve"> then it will not allow user to access that particular end point</w:t>
+      </w:r>
+      <w:r>
+        <w:rPr>
+          <w:sz w:val="28"/>
+          <w:szCs w:val="28"/>
+          <w:lang w:val="en-PK"/>
+        </w:rPr>
+        <w:t xml:space="preserve">Think of this as a </w:t>
+      </w:r>
+      <w:r>
+        <w:rPr>
+          <w:b/>
+          <w:bCs/>
+          <w:sz w:val="28"/>
+          <w:szCs w:val="28"/>
+          <w:lang w:val="en-PK"/>
+        </w:rPr>
+        <w:t>Security Guard</w:t>
+      </w:r>
+      <w:r>
+        <w:rPr>
+          <w:sz w:val="28"/>
+          <w:szCs w:val="28"/>
+          <w:lang w:val="en-PK"/>
+        </w:rPr>
+        <w:t xml:space="preserve"> standing at the door of your API. Its only job is to check if the user has a "Key" (Token) in their hand.</w:t>
+      </w:r>
+    </w:p>
+    <w:p>
+      <w:pPr>
+        <w:pStyle w:val="ListParagraph"/>
+        <w:rPr>
+          <w:sz w:val="28"/>
+          <w:szCs w:val="28"/>
+          <w:lang w:val="en-PK"/>
+        </w:rPr>
+      </w:pPr>
+      <w:r>
+        <w:rPr>
+          <w:b/>
+          <w:bCs/>
+          <w:sz w:val="28"/>
+          <w:szCs w:val="28"/>
+          <w:lang w:val="en-PK"/>
+        </w:rPr>
+        <w:t>What it does:</w:t>
+      </w:r>
+      <w:r>
+        <w:rPr>
+          <w:sz w:val="28"/>
+          <w:szCs w:val="28"/>
+          <w:lang w:val="en-PK"/>
+        </w:rPr>
+        <w:t xml:space="preserve"> It looks at the request header and tries to find the Authorization: Bearer &lt;token&gt;.</w:t>
+      </w:r>
+    </w:p>
+    <w:p>
+      <w:pPr>
+        <w:pStyle w:val="ListParagraph"/>
+        <w:rPr>
+          <w:sz w:val="28"/>
+          <w:szCs w:val="28"/>
+          <w:lang w:val="en-PK"/>
+        </w:rPr>
+      </w:pPr>
+      <w:r>
+        <w:rPr>
+          <w:b/>
+          <w:bCs/>
+          <w:sz w:val="28"/>
+          <w:szCs w:val="28"/>
+          <w:lang w:val="en-PK"/>
+        </w:rPr>
+        <w:t>If found:</w:t>
+      </w:r>
+      <w:r>
+        <w:rPr>
+          <w:sz w:val="28"/>
+          <w:szCs w:val="28"/>
+          <w:lang w:val="en-PK"/>
+        </w:rPr>
+        <w:t xml:space="preserve"> It lets the user in.</w:t>
+      </w:r>
+    </w:p>
+    <w:p>
+      <w:pPr>
+        <w:pStyle w:val="ListParagraph"/>
+        <w:rPr>
+          <w:sz w:val="28"/>
+          <w:szCs w:val="28"/>
+          <w:lang w:val="en-PK"/>
+        </w:rPr>
+      </w:pPr>
+      <w:r>
+        <w:rPr>
+          <w:b/>
+          <w:bCs/>
+          <w:sz w:val="28"/>
+          <w:szCs w:val="28"/>
+          <w:lang w:val="en-PK"/>
+        </w:rPr>
+        <w:t>If not found:</w:t>
+      </w:r>
+      <w:r>
+        <w:rPr>
+          <w:sz w:val="28"/>
+          <w:szCs w:val="28"/>
+          <w:lang w:val="en-PK"/>
+        </w:rPr>
+        <w:t xml:space="preserve"> It tells the user, "Hey! You are not allowed here (401 Unauthorized)."</w:t>
+      </w:r>
+    </w:p>
+    <w:p>
+      <w:pPr>
+        <w:pStyle w:val="ListParagraph"/>
+        <w:rPr>
+          <w:sz w:val="28"/>
+          <w:szCs w:val="28"/>
+          <w:lang w:val="en-PK"/>
+        </w:rPr>
+      </w:pPr>
+      <w:r>
+        <w:rPr>
+          <w:sz w:val="28"/>
+          <w:szCs w:val="28"/>
+          <w:lang w:val="en-PK"/>
+        </w:rPr>
+        <w:drawing>
+          <wp:inline distT="0" distB="0" distL="0" distR="0" wp14:anchorId="48DEABCF" wp14:editId="2172017D">
+            <wp:extent cx="9916909" cy="3400900"/>
+            <wp:effectExtent l="0" t="0" r="0" b="9525"/>
+            <wp:docPr id="997017066" name="Picture 1"/>
+            <wp:cNvGraphicFramePr>
+              <a:graphicFrameLocks xmlns:a="http://schemas.openxmlformats.org/drawingml/2006/main" noChangeAspect="1"/>
+            </wp:cNvGraphicFramePr>
+            <a:graphic xmlns:a="http://schemas.openxmlformats.org/drawingml/2006/main">
+              <a:graphicData uri="http://schemas.openxmlformats.org/drawingml/2006/picture">
+                <pic:pic xmlns:pic="http://schemas.openxmlformats.org/drawingml/2006/picture">
+                  <pic:nvPicPr>
+                    <pic:cNvPr id="997017066" name=""/>
+                    <pic:cNvPicPr/>
+                  </pic:nvPicPr>
+                  <pic:blipFill>
+                    <a:blip r:embed="rId6"/>
+                    <a:stretch>
+                      <a:fillRect/>
+                    </a:stretch>
+                  </pic:blipFill>
+                  <pic:spPr>
+                    <a:xfrm>
+                      <a:off x="0" y="0"/>
+                      <a:ext cx="9916909" cy="3400900"/>
+                    </a:xfrm>
+                    <a:prstGeom prst="rect">
+                      <a:avLst/>
+                    </a:prstGeom>
+                  </pic:spPr>
+                </pic:pic>
+              </a:graphicData>
+            </a:graphic>
+          </wp:inline>
+        </w:drawing>
+      </w:r>
+    </w:p>
+    <w:p>
+      <w:pPr>
+        <w:pStyle w:val="ListParagraph"/>
+        <w:rPr>
+          <w:sz w:val="28"/>
+          <w:szCs w:val="28"/>
+          <w:lang w:val="en-PK"/>
+        </w:rPr>
+      </w:pPr>
+    </w:p>
+    <w:p>
+      <w:pPr>
+        <w:pStyle w:val="ListParagraph"/>
+        <w:rPr>
+          <w:sz w:val="28"/>
+          <w:szCs w:val="28"/>
+          <w:lang w:val="en-PK"/>
+        </w:rPr>
+      </w:pPr>
+      <w:r>
+        <w:rPr>
+          <w:b/>
+          <w:bCs/>
+          <w:sz w:val="28"/>
+          <w:szCs w:val="28"/>
+        </w:rPr>
+        <w:t>4</w:t>
+      </w:r>
+      <w:r>
+        <w:rPr>
+          <w:b/>
+          <w:bCs/>
+          <w:sz w:val="28"/>
+          <w:szCs w:val="28"/>
+        </w:rPr>
+        <w:t>. OAuth2Passwor</w:t>
+      </w:r>
+      <w:r>
+        <w:rPr>
+          <w:b/>
+          <w:bCs/>
+          <w:sz w:val="28"/>
+          <w:szCs w:val="28"/>
+        </w:rPr>
+        <w:t>dRequestForm</w:t>
+      </w:r>
+      <w:r>
+        <w:rPr>
+          <w:b/>
+          <w:bCs/>
+          <w:sz w:val="28"/>
+          <w:szCs w:val="28"/>
+        </w:rPr>
+        <w:t>:</w:t>
+      </w:r>
+      <w:r>
+        <w:rPr>
+          <w:b/>
+          <w:bCs/>
+          <w:sz w:val="28"/>
+          <w:szCs w:val="28"/>
+        </w:rPr>
+        <w:t xml:space="preserve"> </w:t>
+      </w:r>
+      <w:r>
+        <w:rPr>
+          <w:sz w:val="28"/>
+          <w:szCs w:val="28"/>
+        </w:rPr>
+        <w:t xml:space="preserve">This is a special form which Fast API use itself to get user data and then return response </w:t>
+      </w:r>
+      <w:r>
+        <w:rPr>
+          <w:sz w:val="28"/>
+          <w:szCs w:val="28"/>
+          <w:lang w:val="en-PK"/>
+        </w:rPr>
+        <w:t xml:space="preserve">When you go to a hotel, you fill out a specific form with your Name and ID. In OAuth2, this is a </w:t>
+      </w:r>
+      <w:r>
+        <w:rPr>
+          <w:b/>
+          <w:bCs/>
+          <w:sz w:val="28"/>
+          <w:szCs w:val="28"/>
+          <w:lang w:val="en-PK"/>
+        </w:rPr>
+        <w:t>Special Form</w:t>
+      </w:r>
+      <w:r>
+        <w:rPr>
+          <w:sz w:val="28"/>
+          <w:szCs w:val="28"/>
+          <w:lang w:val="en-PK"/>
+        </w:rPr>
+        <w:t xml:space="preserve"> that FastAPI uses for Login.</w:t>
+      </w:r>
+    </w:p>
+    <w:p>
+      <w:pPr>
+        <w:pStyle w:val="ListParagraph"/>
+        <w:rPr>
+          <w:sz w:val="28"/>
+          <w:szCs w:val="28"/>
+          <w:lang w:val="en-PK"/>
+        </w:rPr>
+      </w:pPr>
+      <w:r>
+        <w:rPr>
+          <w:b/>
+          <w:bCs/>
+          <w:sz w:val="28"/>
+          <w:szCs w:val="28"/>
+          <w:lang w:val="en-PK"/>
+        </w:rPr>
+        <w:t>What it does:</w:t>
+      </w:r>
+      <w:r>
+        <w:rPr>
+          <w:sz w:val="28"/>
+          <w:szCs w:val="28"/>
+          <w:lang w:val="en-PK"/>
+        </w:rPr>
+        <w:t xml:space="preserve"> It forces the user to send data as </w:t>
+      </w:r>
+      <w:r>
+        <w:rPr>
+          <w:b/>
+          <w:bCs/>
+          <w:sz w:val="28"/>
+          <w:szCs w:val="28"/>
+          <w:lang w:val="en-PK"/>
+        </w:rPr>
+        <w:t>Form Data</w:t>
+      </w:r>
+      <w:r>
+        <w:rPr>
+          <w:sz w:val="28"/>
+          <w:szCs w:val="28"/>
+          <w:lang w:val="en-PK"/>
+        </w:rPr>
+        <w:t xml:space="preserve"> (not JSON).</w:t>
+      </w:r>
+    </w:p>
+    <w:p>
+      <w:pPr>
+        <w:pStyle w:val="ListParagraph"/>
+        <w:rPr>
+          <w:sz w:val="28"/>
+          <w:szCs w:val="28"/>
+          <w:lang w:val="en-PK"/>
+        </w:rPr>
+      </w:pPr>
+      <w:r>
+        <w:rPr>
+          <w:b/>
+          <w:bCs/>
+          <w:sz w:val="28"/>
+          <w:szCs w:val="28"/>
+          <w:lang w:val="en-PK"/>
+        </w:rPr>
+        <w:t>Rules:</w:t>
+      </w:r>
+      <w:r>
+        <w:rPr>
+          <w:sz w:val="28"/>
+          <w:szCs w:val="28"/>
+          <w:lang w:val="en-PK"/>
+        </w:rPr>
+        <w:t xml:space="preserve"> It strictly looks for two fields: username and password. Even if you are using an email to log in, you must send it inside the username field.</w:t>
+      </w:r>
+    </w:p>
+    <w:p>
+      <w:pPr>
+        <w:pStyle w:val="ListParagraph"/>
+        <w:rPr>
+          <w:sz w:val="28"/>
+          <w:szCs w:val="28"/>
+          <w:lang w:val="en-PK"/>
+        </w:rPr>
+      </w:pPr>
+      <w:r>
+        <w:rPr>
+          <w:sz w:val="28"/>
+          <w:szCs w:val="28"/>
+          <w:lang w:val="en-PK"/>
+        </w:rPr>
+        <w:drawing>
+          <wp:inline distT="0" distB="0" distL="0" distR="0" wp14:anchorId="1992F56E" wp14:editId="35DE3A7A">
+            <wp:extent cx="9316750" cy="3219899"/>
+            <wp:effectExtent l="0" t="0" r="0" b="0"/>
+            <wp:docPr id="652296201" name="Picture 1"/>
+            <wp:cNvGraphicFramePr>
+              <a:graphicFrameLocks xmlns:a="http://schemas.openxmlformats.org/drawingml/2006/main" noChangeAspect="1"/>
+            </wp:cNvGraphicFramePr>
+            <a:graphic xmlns:a="http://schemas.openxmlformats.org/drawingml/2006/main">
+              <a:graphicData uri="http://schemas.openxmlformats.org/drawingml/2006/picture">
+                <pic:pic xmlns:pic="http://schemas.openxmlformats.org/drawingml/2006/picture">
+                  <pic:nvPicPr>
+                    <pic:cNvPr id="652296201" name=""/>
+                    <pic:cNvPicPr/>
+                  </pic:nvPicPr>
+                  <pic:blipFill>
+                    <a:blip r:embed="rId7"/>
+                    <a:stretch>
+                      <a:fillRect/>
+                    </a:stretch>
+                  </pic:blipFill>
+                  <pic:spPr>
+                    <a:xfrm>
+                      <a:off x="0" y="0"/>
+                      <a:ext cx="9316750" cy="3219899"/>
+                    </a:xfrm>
+                    <a:prstGeom prst="rect">
+                      <a:avLst/>
+                    </a:prstGeom>
+                  </pic:spPr>
+                </pic:pic>
+              </a:graphicData>
+            </a:graphic>
+          </wp:inline>
+        </w:drawing>
+      </w:r>
+    </w:p>
+    <w:p>
+      <w:pPr>
+        <w:pStyle w:val="ListParagraph"/>
+        <w:rPr>
+          <w:sz w:val="28"/>
+          <w:szCs w:val="28"/>
+          <w:lang w:val="en-PK"/>
+        </w:rPr>
+      </w:pPr>
+    </w:p>
+    <w:p>
+      <w:pPr>
+        <w:pStyle w:val="ListParagraph"/>
+        <w:rPr>
+          <w:sz w:val="28"/>
+          <w:szCs w:val="28"/>
+          <w:lang w:val="en-PK"/>
+        </w:rPr>
+      </w:pPr>
+    </w:p>
+    <w:p>
+      <w:pPr>
+        <w:rPr>
+          <w:sz w:val="28"/>
+          <w:szCs w:val="28"/>
+          <w:lang w:val="en-PK"/>
+        </w:rPr>
+      </w:pPr>
+      <w:r>
+        <w:rPr>
+          <w:sz w:val="28"/>
+          <w:szCs w:val="28"/>
+          <w:lang w:val="en-PK"/>
+        </w:rPr>
+        <w:tab/>
+        <w:t xml:space="preserve">When we call an HTTP method in Fast API then in this HTTP method, we also pass an attribute </w:t>
+      </w:r>
+      <w:r>
+        <w:rPr>
+          <w:b/>
+          <w:bCs/>
+          <w:sz w:val="28"/>
+          <w:szCs w:val="28"/>
+          <w:lang w:val="en-PK"/>
+        </w:rPr>
+        <w:t>`respone_model`=User Response Schema</w:t>
+      </w:r>
+      <w:r>
+        <w:rPr>
+          <w:b/>
+          <w:bCs/>
+          <w:sz w:val="28"/>
+          <w:szCs w:val="28"/>
+          <w:lang w:val="en-PK"/>
+        </w:rPr>
+        <w:t xml:space="preserve"> </w:t>
+      </w:r>
+      <w:r>
+        <w:rPr>
+          <w:sz w:val="28"/>
+          <w:szCs w:val="28"/>
+          <w:lang w:val="en-PK"/>
+        </w:rPr>
+        <w:t>we use it because if user has not returned all the attributes present in UserResponseSchema an error will raise</w:t>
+      </w:r>
+    </w:p>
+    <w:p>
+      <w:pPr>
+        <w:rPr>
+          <w:b/>
+          <w:bCs/>
+          <w:sz w:val="28"/>
+          <w:szCs w:val="28"/>
+          <w:lang w:val="en-PK"/>
+        </w:rPr>
+      </w:pPr>
+      <w:r>
+        <w:rPr>
+          <w:sz w:val="28"/>
+          <w:szCs w:val="28"/>
+          <w:lang w:val="en-PK"/>
+        </w:rPr>
+        <w:t xml:space="preserve">One important thing which you need to remember is that when we are using Fast API and suppose we are working on </w:t>
+      </w:r>
+      <w:r>
+        <w:rPr>
+          <w:b/>
+          <w:bCs/>
+          <w:sz w:val="28"/>
+          <w:szCs w:val="28"/>
+          <w:lang w:val="en-PK"/>
+        </w:rPr>
+        <w:t>Register New User</w:t>
+      </w:r>
+    </w:p>
+    <w:p>
+      <w:pPr>
+        <w:pStyle w:val="ListParagraph"/>
+        <w:rPr>
+          <w:sz w:val="28"/>
+          <w:szCs w:val="28"/>
+          <w:lang w:val="en-PK"/>
+        </w:rPr>
+      </w:pPr>
+    </w:p>
+    <w:p>
+      <w:pPr>
+        <w:pStyle w:val="ListParagraph"/>
+        <w:rPr>
+          <w:sz w:val="28"/>
+          <w:szCs w:val="28"/>
+          <w:lang w:val="en-PK"/>
+        </w:rPr>
+      </w:pPr>
+      <w:r>
+        <w:rPr>
+          <w:sz w:val="28"/>
+          <w:szCs w:val="28"/>
+          <w:lang w:val="en-PK"/>
+        </w:rPr>
+        <w:drawing>
+          <wp:inline distT="0" distB="0" distL="0" distR="0" wp14:anchorId="6F99FEFD" wp14:editId="3A0E2323">
+            <wp:extent cx="8068475" cy="3172688"/>
+            <wp:effectExtent l="0" t="0" r="8890" b="8890"/>
+            <wp:docPr id="1910847864" name="Picture 1"/>
+            <wp:cNvGraphicFramePr>
+              <a:graphicFrameLocks xmlns:a="http://schemas.openxmlformats.org/drawingml/2006/main" noChangeAspect="1"/>
+            </wp:cNvGraphicFramePr>
+            <a:graphic xmlns:a="http://schemas.openxmlformats.org/drawingml/2006/main">
+              <a:graphicData uri="http://schemas.openxmlformats.org/drawingml/2006/picture">
+                <pic:pic xmlns:pic="http://schemas.openxmlformats.org/drawingml/2006/picture">
+                  <pic:nvPicPr>
+                    <pic:cNvPr id="1910847864" name=""/>
+                    <pic:cNvPicPr/>
+                  </pic:nvPicPr>
+                  <pic:blipFill>
+                    <a:blip r:embed="rId8"/>
+                    <a:stretch>
+                      <a:fillRect/>
+                    </a:stretch>
+                  </pic:blipFill>
+                  <pic:spPr>
+                    <a:xfrm>
+                      <a:off x="0" y="0"/>
+                      <a:ext cx="8075853" cy="3175589"/>
+                    </a:xfrm>
+                    <a:prstGeom prst="rect">
+                      <a:avLst/>
+                    </a:prstGeom>
+                  </pic:spPr>
+                </pic:pic>
+              </a:graphicData>
+            </a:graphic>
+          </wp:inline>
+        </w:drawing>
+      </w:r>
+    </w:p>
+    <w:p>
+      <w:pPr>
+        <w:pStyle w:val="ListParagraph"/>
+        <w:rPr>
+          <w:sz w:val="28"/>
+          <w:szCs w:val="28"/>
+        </w:rPr>
+      </w:pPr>
+    </w:p>
+    <w:p>
+      <w:pPr>
         <w:ind w:left="360"/>
         <w:rPr>
           <w:sz w:val="28"/>
@@ -745,6 +1302,14 @@
           <w:lang w:val="en-US"/>
         </w:rPr>
       </w:pPr>
+      <w:r>
+        <w:rPr>
+          <w:sz w:val="28"/>
+          <w:szCs w:val="28"/>
+          <w:lang w:val="en-US"/>
+        </w:rPr>
+        <w:t>Here in the above code UserRegisterSchema is pydantic Validation class for registering new user first of you will create its object and now you will use this object to access its attribute</w:t>
+      </w:r>
     </w:p>
     <w:sectPr>
       <w:pgSz w:w="11906" w:h="16838"/>
@@ -759,6 +1324,155 @@
 <file path=word/numbering.xml><?xml version="1.0" encoding="utf-8"?>
 <w:numbering xmlns:wpc="http://schemas.microsoft.com/office/word/2010/wordprocessingCanvas" xmlns:cx="http://schemas.microsoft.com/office/drawing/2014/chartex" xmlns:cx1="http://schemas.microsoft.com/office/drawing/2015/9/8/chartex" xmlns:cx2="http://schemas.microsoft.com/office/drawing/2015/10/21/chartex" xmlns:cx3="http://schemas.microsoft.com/office/drawing/2016/5/9/chartex" xmlns:cx4="http://schemas.microsoft.com/office/drawing/2016/5/10/chartex" xmlns:cx5="http://schemas.microsoft.com/office/drawing/2016/5/11/chartex" xmlns:cx6="http://schemas.microsoft.com/office/drawing/2016/5/12/chartex" xmlns:cx7="http://schemas.microsoft.com/office/drawing/2016/5/13/chartex" xmlns:cx8="http://schemas.microsoft.com/office/drawing/2016/5/14/chartex" xmlns:mc="http://schemas.openxmlformats.org/markup-compatibility/2006" xmlns:aink="http://schemas.microsoft.com/office/drawing/2016/ink" xmlns:am3d="http://schemas.microsoft.com/office/drawing/2017/model3d" xmlns:o="urn:schemas-microsoft-com:office:office" xmlns:oel="http://schemas.microsoft.com/office/2019/extlst" xmlns:r="http://schemas.openxmlformats.org/officeDocument/2006/relationships" xmlns:m="http://schemas.openxmlformats.org/officeDocument/2006/math" xmlns:v="urn:schemas-microsoft-com:vml" xmlns:wp14="http://schemas.microsoft.com/office/word/2010/wordprocessingDrawing" xmlns:wp="http://schemas.openxmlformats.org/drawingml/2006/wordprocessingDrawing" xmlns:w10="urn:schemas-microsoft-com:office:word" xmlns:w="http://schemas.openxmlformats.org/wordprocessingml/2006/main" xmlns:w14="http://schemas.microsoft.com/office/word/2010/wordml" xmlns:w15="http://schemas.microsoft.com/office/word/2012/wordml" xmlns:w16cex="http://schemas.microsoft.com/office/word/2018/wordml/cex" xmlns:w16cid="http://schemas.microsoft.com/office/word/2016/wordml/cid" xmlns:w16="http://schemas.microsoft.com/office/word/2018/wordml" xmlns:w16du="http://schemas.microsoft.com/office/word/2023/wordml/word16du" xmlns:w16sdtdh="http://schemas.microsoft.com/office/word/2020/wordml/sdtdatahash" xmlns:w16sdtfl="http://schemas.microsoft.com/office/word/2024/wordml/sdtformatlock" xmlns:w16se="http://schemas.microsoft.com/office/word/2015/wordml/symex" xmlns:wpg="http://schemas.microsoft.com/office/word/2010/wordprocessingGroup" xmlns:wpi="http://schemas.microsoft.com/office/word/2010/wordprocessingInk" xmlns:wne="http://schemas.microsoft.com/office/word/2006/wordml" xmlns:wps="http://schemas.microsoft.com/office/word/2010/wordprocessingShape" mc:Ignorable="w14 w15 w16se w16cid w16 w16cex w16sdtdh w16sdtfl w16du wp14">
   <w:abstractNum w:abstractNumId="0" w15:restartNumberingAfterBreak="0">
+    <w:nsid w:val="089F77B2"/>
+    <w:multiLevelType w:val="multilevel"/>
+    <w:tmpl w:val="637E60D4"/>
+    <w:lvl w:ilvl="0">
+      <w:start w:val="1"/>
+      <w:numFmt w:val="bullet"/>
+      <w:lvlText w:val=""/>
+      <w:lvlJc w:val="left"/>
+      <w:pPr>
+        <w:tabs>
+          <w:tab w:val="num" w:pos="720"/>
+        </w:tabs>
+        <w:ind w:left="720" w:hanging="360"/>
+      </w:pPr>
+      <w:rPr>
+        <w:rFonts w:ascii="Symbol" w:hAnsi="Symbol" w:hint="default"/>
+        <w:sz w:val="20"/>
+      </w:rPr>
+    </w:lvl>
+    <w:lvl w:ilvl="1" w:tentative="1">
+      <w:start w:val="1"/>
+      <w:numFmt w:val="bullet"/>
+      <w:lvlText w:val="o"/>
+      <w:lvlJc w:val="left"/>
+      <w:pPr>
+        <w:tabs>
+          <w:tab w:val="num" w:pos="1440"/>
+        </w:tabs>
+        <w:ind w:left="1440" w:hanging="360"/>
+      </w:pPr>
+      <w:rPr>
+        <w:rFonts w:ascii="Courier New" w:hAnsi="Courier New" w:hint="default"/>
+        <w:sz w:val="20"/>
+      </w:rPr>
+    </w:lvl>
+    <w:lvl w:ilvl="2" w:tentative="1">
+      <w:start w:val="1"/>
+      <w:numFmt w:val="bullet"/>
+      <w:lvlText w:val=""/>
+      <w:lvlJc w:val="left"/>
+      <w:pPr>
+        <w:tabs>
+          <w:tab w:val="num" w:pos="2160"/>
+        </w:tabs>
+        <w:ind w:left="2160" w:hanging="360"/>
+      </w:pPr>
+      <w:rPr>
+        <w:rFonts w:ascii="Wingdings" w:hAnsi="Wingdings" w:hint="default"/>
+        <w:sz w:val="20"/>
+      </w:rPr>
+    </w:lvl>
+    <w:lvl w:ilvl="3" w:tentative="1">
+      <w:start w:val="1"/>
+      <w:numFmt w:val="bullet"/>
+      <w:lvlText w:val=""/>
+      <w:lvlJc w:val="left"/>
+      <w:pPr>
+        <w:tabs>
+          <w:tab w:val="num" w:pos="2880"/>
+        </w:tabs>
+        <w:ind w:left="2880" w:hanging="360"/>
+      </w:pPr>
+      <w:rPr>
+        <w:rFonts w:ascii="Wingdings" w:hAnsi="Wingdings" w:hint="default"/>
+        <w:sz w:val="20"/>
+      </w:rPr>
+    </w:lvl>
+    <w:lvl w:ilvl="4" w:tentative="1">
+      <w:start w:val="1"/>
+      <w:numFmt w:val="bullet"/>
+      <w:lvlText w:val=""/>
+      <w:lvlJc w:val="left"/>
+      <w:pPr>
+        <w:tabs>
+          <w:tab w:val="num" w:pos="3600"/>
+        </w:tabs>
+        <w:ind w:left="3600" w:hanging="360"/>
+      </w:pPr>
+      <w:rPr>
+        <w:rFonts w:ascii="Wingdings" w:hAnsi="Wingdings" w:hint="default"/>
+        <w:sz w:val="20"/>
+      </w:rPr>
+    </w:lvl>
+    <w:lvl w:ilvl="5" w:tentative="1">
+      <w:start w:val="1"/>
+      <w:numFmt w:val="bullet"/>
+      <w:lvlText w:val=""/>
+      <w:lvlJc w:val="left"/>
+      <w:pPr>
+        <w:tabs>
+          <w:tab w:val="num" w:pos="4320"/>
+        </w:tabs>
+        <w:ind w:left="4320" w:hanging="360"/>
+      </w:pPr>
+      <w:rPr>
+        <w:rFonts w:ascii="Wingdings" w:hAnsi="Wingdings" w:hint="default"/>
+        <w:sz w:val="20"/>
+      </w:rPr>
+    </w:lvl>
+    <w:lvl w:ilvl="6" w:tentative="1">
+      <w:start w:val="1"/>
+      <w:numFmt w:val="bullet"/>
+      <w:lvlText w:val=""/>
+      <w:lvlJc w:val="left"/>
+      <w:pPr>
+        <w:tabs>
+          <w:tab w:val="num" w:pos="5040"/>
+        </w:tabs>
+        <w:ind w:left="5040" w:hanging="360"/>
+      </w:pPr>
+      <w:rPr>
+        <w:rFonts w:ascii="Wingdings" w:hAnsi="Wingdings" w:hint="default"/>
+        <w:sz w:val="20"/>
+      </w:rPr>
+    </w:lvl>
+    <w:lvl w:ilvl="7" w:tentative="1">
+      <w:start w:val="1"/>
+      <w:numFmt w:val="bullet"/>
+      <w:lvlText w:val=""/>
+      <w:lvlJc w:val="left"/>
+      <w:pPr>
+        <w:tabs>
+          <w:tab w:val="num" w:pos="5760"/>
+        </w:tabs>
+        <w:ind w:left="5760" w:hanging="360"/>
+      </w:pPr>
+      <w:rPr>
+        <w:rFonts w:ascii="Wingdings" w:hAnsi="Wingdings" w:hint="default"/>
+        <w:sz w:val="20"/>
+      </w:rPr>
+    </w:lvl>
+    <w:lvl w:ilvl="8" w:tentative="1">
+      <w:start w:val="1"/>
+      <w:numFmt w:val="bullet"/>
+      <w:lvlText w:val=""/>
+      <w:lvlJc w:val="left"/>
+      <w:pPr>
+        <w:tabs>
+          <w:tab w:val="num" w:pos="6480"/>
+        </w:tabs>
+        <w:ind w:left="6480" w:hanging="360"/>
+      </w:pPr>
+      <w:rPr>
+        <w:rFonts w:ascii="Wingdings" w:hAnsi="Wingdings" w:hint="default"/>
+        <w:sz w:val="20"/>
+      </w:rPr>
+    </w:lvl>
+  </w:abstractNum>
+  <w:abstractNum w:abstractNumId="1" w15:restartNumberingAfterBreak="0">
     <w:nsid w:val="3550046A"/>
     <w:multiLevelType w:val="multilevel"/>
     <w:tmpl w:val="FDA65466"/>
@@ -907,7 +1621,7 @@
       </w:rPr>
     </w:lvl>
   </w:abstractNum>
-  <w:abstractNum w:abstractNumId="1" w15:restartNumberingAfterBreak="0">
+  <w:abstractNum w:abstractNumId="2" w15:restartNumberingAfterBreak="0">
     <w:nsid w:val="4C56365B"/>
     <w:multiLevelType w:val="multilevel"/>
     <w:tmpl w:val="D99E3042"/>
@@ -1052,7 +1766,7 @@
       </w:rPr>
     </w:lvl>
   </w:abstractNum>
-  <w:abstractNum w:abstractNumId="2" w15:restartNumberingAfterBreak="0">
+  <w:abstractNum w:abstractNumId="3" w15:restartNumberingAfterBreak="0">
     <w:nsid w:val="74A3573E"/>
     <w:multiLevelType w:val="hybridMultilevel"/>
     <w:tmpl w:val="49886D2E"/>
@@ -1141,14 +1855,169 @@
       </w:pPr>
     </w:lvl>
   </w:abstractNum>
+  <w:abstractNum w:abstractNumId="4" w15:restartNumberingAfterBreak="0">
+    <w:nsid w:val="792839EB"/>
+    <w:multiLevelType w:val="multilevel"/>
+    <w:tmpl w:val="66846806"/>
+    <w:lvl w:ilvl="0">
+      <w:start w:val="1"/>
+      <w:numFmt w:val="bullet"/>
+      <w:lvlText w:val=""/>
+      <w:lvlJc w:val="left"/>
+      <w:pPr>
+        <w:tabs>
+          <w:tab w:val="num" w:pos="720"/>
+        </w:tabs>
+        <w:ind w:left="720" w:hanging="360"/>
+      </w:pPr>
+      <w:rPr>
+        <w:rFonts w:ascii="Symbol" w:hAnsi="Symbol" w:hint="default"/>
+        <w:sz w:val="20"/>
+      </w:rPr>
+    </w:lvl>
+    <w:lvl w:ilvl="1" w:tentative="1">
+      <w:start w:val="1"/>
+      <w:numFmt w:val="bullet"/>
+      <w:lvlText w:val="o"/>
+      <w:lvlJc w:val="left"/>
+      <w:pPr>
+        <w:tabs>
+          <w:tab w:val="num" w:pos="1440"/>
+        </w:tabs>
+        <w:ind w:left="1440" w:hanging="360"/>
+      </w:pPr>
+      <w:rPr>
+        <w:rFonts w:ascii="Courier New" w:hAnsi="Courier New" w:hint="default"/>
+        <w:sz w:val="20"/>
+      </w:rPr>
+    </w:lvl>
+    <w:lvl w:ilvl="2" w:tentative="1">
+      <w:start w:val="1"/>
+      <w:numFmt w:val="bullet"/>
+      <w:lvlText w:val=""/>
+      <w:lvlJc w:val="left"/>
+      <w:pPr>
+        <w:tabs>
+          <w:tab w:val="num" w:pos="2160"/>
+        </w:tabs>
+        <w:ind w:left="2160" w:hanging="360"/>
+      </w:pPr>
+      <w:rPr>
+        <w:rFonts w:ascii="Wingdings" w:hAnsi="Wingdings" w:hint="default"/>
+        <w:sz w:val="20"/>
+      </w:rPr>
+    </w:lvl>
+    <w:lvl w:ilvl="3" w:tentative="1">
+      <w:start w:val="1"/>
+      <w:numFmt w:val="bullet"/>
+      <w:lvlText w:val=""/>
+      <w:lvlJc w:val="left"/>
+      <w:pPr>
+        <w:tabs>
+          <w:tab w:val="num" w:pos="2880"/>
+        </w:tabs>
+        <w:ind w:left="2880" w:hanging="360"/>
+      </w:pPr>
+      <w:rPr>
+        <w:rFonts w:ascii="Wingdings" w:hAnsi="Wingdings" w:hint="default"/>
+        <w:sz w:val="20"/>
+      </w:rPr>
+    </w:lvl>
+    <w:lvl w:ilvl="4" w:tentative="1">
+      <w:start w:val="1"/>
+      <w:numFmt w:val="bullet"/>
+      <w:lvlText w:val=""/>
+      <w:lvlJc w:val="left"/>
+      <w:pPr>
+        <w:tabs>
+          <w:tab w:val="num" w:pos="3600"/>
+        </w:tabs>
+        <w:ind w:left="3600" w:hanging="360"/>
+      </w:pPr>
+      <w:rPr>
+        <w:rFonts w:ascii="Wingdings" w:hAnsi="Wingdings" w:hint="default"/>
+        <w:sz w:val="20"/>
+      </w:rPr>
+    </w:lvl>
+    <w:lvl w:ilvl="5" w:tentative="1">
+      <w:start w:val="1"/>
+      <w:numFmt w:val="bullet"/>
+      <w:lvlText w:val=""/>
+      <w:lvlJc w:val="left"/>
+      <w:pPr>
+        <w:tabs>
+          <w:tab w:val="num" w:pos="4320"/>
+        </w:tabs>
+        <w:ind w:left="4320" w:hanging="360"/>
+      </w:pPr>
+      <w:rPr>
+        <w:rFonts w:ascii="Wingdings" w:hAnsi="Wingdings" w:hint="default"/>
+        <w:sz w:val="20"/>
+      </w:rPr>
+    </w:lvl>
+    <w:lvl w:ilvl="6" w:tentative="1">
+      <w:start w:val="1"/>
+      <w:numFmt w:val="bullet"/>
+      <w:lvlText w:val=""/>
+      <w:lvlJc w:val="left"/>
+      <w:pPr>
+        <w:tabs>
+          <w:tab w:val="num" w:pos="5040"/>
+        </w:tabs>
+        <w:ind w:left="5040" w:hanging="360"/>
+      </w:pPr>
+      <w:rPr>
+        <w:rFonts w:ascii="Wingdings" w:hAnsi="Wingdings" w:hint="default"/>
+        <w:sz w:val="20"/>
+      </w:rPr>
+    </w:lvl>
+    <w:lvl w:ilvl="7" w:tentative="1">
+      <w:start w:val="1"/>
+      <w:numFmt w:val="bullet"/>
+      <w:lvlText w:val=""/>
+      <w:lvlJc w:val="left"/>
+      <w:pPr>
+        <w:tabs>
+          <w:tab w:val="num" w:pos="5760"/>
+        </w:tabs>
+        <w:ind w:left="5760" w:hanging="360"/>
+      </w:pPr>
+      <w:rPr>
+        <w:rFonts w:ascii="Wingdings" w:hAnsi="Wingdings" w:hint="default"/>
+        <w:sz w:val="20"/>
+      </w:rPr>
+    </w:lvl>
+    <w:lvl w:ilvl="8" w:tentative="1">
+      <w:start w:val="1"/>
+      <w:numFmt w:val="bullet"/>
+      <w:lvlText w:val=""/>
+      <w:lvlJc w:val="left"/>
+      <w:pPr>
+        <w:tabs>
+          <w:tab w:val="num" w:pos="6480"/>
+        </w:tabs>
+        <w:ind w:left="6480" w:hanging="360"/>
+      </w:pPr>
+      <w:rPr>
+        <w:rFonts w:ascii="Wingdings" w:hAnsi="Wingdings" w:hint="default"/>
+        <w:sz w:val="20"/>
+      </w:rPr>
+    </w:lvl>
+  </w:abstractNum>
   <w:num w:numId="1" w16cid:durableId="1359702093">
+    <w:abstractNumId w:val="3"/>
+  </w:num>
+  <w:num w:numId="2" w16cid:durableId="409892012">
+    <w:abstractNumId w:val="1"/>
+  </w:num>
+  <w:num w:numId="3" w16cid:durableId="1907186383">
     <w:abstractNumId w:val="2"/>
   </w:num>
-  <w:num w:numId="2" w16cid:durableId="409892012">
+  <w:num w:numId="4" w16cid:durableId="2102680640">
     <w:abstractNumId w:val="0"/>
   </w:num>
-  <w:num w:numId="3" w16cid:durableId="1907186383">
-    <w:abstractNumId w:val="1"/>
+  <w:num w:numId="5" w16cid:durableId="201526510">
+    <w:abstractNumId w:val="4"/>
   </w:num>
 </w:numbering>
 </file>
@@ -1551,7 +2420,7 @@
   <w:style w:type="paragraph" w:default="1" w:styleId="Normal">
     <w:name w:val="Normal"/>
     <w:qFormat/>
-    <w:rsid w:val="00E10F25"/>
+    <w:rsid w:val="00444898"/>
   </w:style>
   <w:style w:type="paragraph" w:styleId="Heading1">
     <w:name w:val="heading 1"/>
@@ -2193,6 +3062,19 @@
     <w:pPr>
       <w:outlineLvl w:val="9"/>
     </w:pPr>
+  </w:style>
+  <w:style w:type="paragraph" w:styleId="NormalWeb">
+    <w:name w:val="Normal (Web)"/>
+    <w:basedOn w:val="Normal"/>
+    <w:uiPriority w:val="99"/>
+    <w:semiHidden/>
+    <w:unhideWhenUsed/>
+    <w:rsid w:val="00444898"/>
+    <w:rPr>
+      <w:rFonts w:ascii="Times New Roman" w:hAnsi="Times New Roman" w:cs="Times New Roman"/>
+      <w:sz w:val="24"/>
+      <w:szCs w:val="24"/>
+    </w:rPr>
   </w:style>
 </w:styles>
 </file>

</xml_diff>